<commit_message>
fix: adiciona <<assinatura_cliente>> (branco) antes do nome nas procurações
Placeholder estava ausente no novo template narrativo. ZapSign posiciona
a assinatura do cliente sobre este marcador em todos os 39 templates.

Co-Authored-By: Claude Sonnet 4.6 <noreply@anthropic.com>
</commit_message>
<xml_diff>
--- a/backend/modelos/ana/modelo_procuracao_ana.docx
+++ b/backend/modelos/ana/modelo_procuracao_ana.docx
@@ -241,6 +241,17 @@
           <w:lang w:val="pt-BR"/>
         </w:rPr>
       </w:pPr>
+    </w:p>
+    <w:p>
+      <w:pPr>
+        <w:pStyle w:val="ListParagraph"/>
+      </w:pPr>
+      <w:r>
+        <w:rPr>
+          <w:color w:val="FFFFFF"/>
+        </w:rPr>
+        <w:t>&lt;&lt;assinatura_cliente&gt;&gt;</w:t>
+      </w:r>
     </w:p>
     <w:p>
       <w:pPr>

</xml_diff>